<commit_message>
02.10.2026 · günlük planlar ders gününe bölündü: 9 ve 10. sınıfta hafta 2 ders günü (74 plan), ötekilerde tek blok (37 plan)
</commit_message>
<xml_diff>
--- a/dosyalar/yillik-plan/arapca-5-sinif-yillik-plan.docx
+++ b/dosyalar/yillik-plan/arapca-5-sinif-yillik-plan.docx
@@ -1324,6 +1324,26 @@
               <w:t xml:space="preserve">• Sesletim: Harflerin mahreçleri, fetha</w:t>
             </w:r>
           </w:p>
+          <w:p>
+            <w:pPr>
+              <w:spacing w:after="30" w:line="230"/>
+              <w:ind w:left="130" w:hanging="130"/>
+              <w:jc w:val="left"/>
+            </w:pPr>
+            <w:r>
+              <w:rPr>
+                <w:rFonts w:ascii="Times New Roman" w:cs="Times New Roman" w:eastAsia="Times New Roman" w:hAnsi="Times New Roman"/>
+                <w:b w:val="false"/>
+                <w:bCs w:val="false"/>
+                <w:i w:val="false"/>
+                <w:iCs w:val="false"/>
+                <w:color w:val="1A1A1A"/>
+                <w:sz w:val="15"/>
+                <w:szCs w:val="15"/>
+              </w:rPr>
+              <w:t xml:space="preserve">• Ders kitabı: s. 10-17</w:t>
+            </w:r>
+          </w:p>
         </w:tc>
         <w:tc>
           <w:tcPr>
@@ -1885,6 +1905,26 @@
               <w:t xml:space="preserve">• Sesletim: Damme ve kesra</w:t>
             </w:r>
           </w:p>
+          <w:p>
+            <w:pPr>
+              <w:spacing w:after="30" w:line="230"/>
+              <w:ind w:left="130" w:hanging="130"/>
+              <w:jc w:val="left"/>
+            </w:pPr>
+            <w:r>
+              <w:rPr>
+                <w:rFonts w:ascii="Times New Roman" w:cs="Times New Roman" w:eastAsia="Times New Roman" w:hAnsi="Times New Roman"/>
+                <w:b w:val="false"/>
+                <w:bCs w:val="false"/>
+                <w:i w:val="false"/>
+                <w:iCs w:val="false"/>
+                <w:color w:val="1A1A1A"/>
+                <w:sz w:val="15"/>
+                <w:szCs w:val="15"/>
+              </w:rPr>
+              <w:t xml:space="preserve">• Ders kitabı: s. 18-24</w:t>
+            </w:r>
+          </w:p>
         </w:tc>
         <w:tc>
           <w:tcPr>
@@ -2466,6 +2506,26 @@
               <w:t xml:space="preserve">• Yazma: Sağdan sola yazı yönü, kalem tutuşu, satır çalışması</w:t>
             </w:r>
           </w:p>
+          <w:p>
+            <w:pPr>
+              <w:spacing w:after="30" w:line="230"/>
+              <w:ind w:left="130" w:hanging="130"/>
+              <w:jc w:val="left"/>
+            </w:pPr>
+            <w:r>
+              <w:rPr>
+                <w:rFonts w:ascii="Times New Roman" w:cs="Times New Roman" w:eastAsia="Times New Roman" w:hAnsi="Times New Roman"/>
+                <w:b w:val="false"/>
+                <w:bCs w:val="false"/>
+                <w:i w:val="false"/>
+                <w:iCs w:val="false"/>
+                <w:color w:val="1A1A1A"/>
+                <w:sz w:val="15"/>
+                <w:szCs w:val="15"/>
+              </w:rPr>
+              <w:t xml:space="preserve">• Ders kitabı: s. 25-31</w:t>
+            </w:r>
+          </w:p>
         </w:tc>
         <w:tc>
           <w:tcPr>
@@ -3027,6 +3087,26 @@
               <w:t xml:space="preserve">• Yazma: Müstakil harfleri ve harekeleri modelden kopyalama</w:t>
             </w:r>
           </w:p>
+          <w:p>
+            <w:pPr>
+              <w:spacing w:after="30" w:line="230"/>
+              <w:ind w:left="130" w:hanging="130"/>
+              <w:jc w:val="left"/>
+            </w:pPr>
+            <w:r>
+              <w:rPr>
+                <w:rFonts w:ascii="Times New Roman" w:cs="Times New Roman" w:eastAsia="Times New Roman" w:hAnsi="Times New Roman"/>
+                <w:b w:val="false"/>
+                <w:bCs w:val="false"/>
+                <w:i w:val="false"/>
+                <w:iCs w:val="false"/>
+                <w:color w:val="1A1A1A"/>
+                <w:sz w:val="15"/>
+                <w:szCs w:val="15"/>
+              </w:rPr>
+              <w:t xml:space="preserve">• Ders kitabı: s. 32-38</w:t>
+            </w:r>
+          </w:p>
         </w:tc>
         <w:tc>
           <w:tcPr>
@@ -3588,6 +3668,26 @@
               <w:t xml:space="preserve">• Sözcük: tâlib / tâlibe, muallim / muallime, sadîk / sadîka</w:t>
             </w:r>
           </w:p>
+          <w:p>
+            <w:pPr>
+              <w:spacing w:after="30" w:line="230"/>
+              <w:ind w:left="130" w:hanging="130"/>
+              <w:jc w:val="left"/>
+            </w:pPr>
+            <w:r>
+              <w:rPr>
+                <w:rFonts w:ascii="Times New Roman" w:cs="Times New Roman" w:eastAsia="Times New Roman" w:hAnsi="Times New Roman"/>
+                <w:b w:val="false"/>
+                <w:bCs w:val="false"/>
+                <w:i w:val="false"/>
+                <w:iCs w:val="false"/>
+                <w:color w:val="1A1A1A"/>
+                <w:sz w:val="15"/>
+                <w:szCs w:val="15"/>
+              </w:rPr>
+              <w:t xml:space="preserve">• Ders kitabı: s. 39-45</w:t>
+            </w:r>
+          </w:p>
         </w:tc>
         <w:tc>
           <w:tcPr>
@@ -4149,6 +4249,26 @@
               <w:t xml:space="preserve">• Sözcük: neam, lâ, şükran, afven, min fadlik</w:t>
             </w:r>
           </w:p>
+          <w:p>
+            <w:pPr>
+              <w:spacing w:after="30" w:line="230"/>
+              <w:ind w:left="130" w:hanging="130"/>
+              <w:jc w:val="left"/>
+            </w:pPr>
+            <w:r>
+              <w:rPr>
+                <w:rFonts w:ascii="Times New Roman" w:cs="Times New Roman" w:eastAsia="Times New Roman" w:hAnsi="Times New Roman"/>
+                <w:b w:val="false"/>
+                <w:bCs w:val="false"/>
+                <w:i w:val="false"/>
+                <w:iCs w:val="false"/>
+                <w:color w:val="1A1A1A"/>
+                <w:sz w:val="15"/>
+                <w:szCs w:val="15"/>
+              </w:rPr>
+              <w:t xml:space="preserve">• Ders kitabı: s. 46-52</w:t>
+            </w:r>
+          </w:p>
         </w:tc>
         <w:tc>
           <w:tcPr>
@@ -4730,6 +4850,26 @@
               <w:t xml:space="preserve">• Dil bilgisi: “hel ente…? / hel enti…?” soru kalıbı</w:t>
             </w:r>
           </w:p>
+          <w:p>
+            <w:pPr>
+              <w:spacing w:after="30" w:line="230"/>
+              <w:ind w:left="130" w:hanging="130"/>
+              <w:jc w:val="left"/>
+            </w:pPr>
+            <w:r>
+              <w:rPr>
+                <w:rFonts w:ascii="Times New Roman" w:cs="Times New Roman" w:eastAsia="Times New Roman" w:hAnsi="Times New Roman"/>
+                <w:b w:val="false"/>
+                <w:bCs w:val="false"/>
+                <w:i w:val="false"/>
+                <w:iCs w:val="false"/>
+                <w:color w:val="1A1A1A"/>
+                <w:sz w:val="15"/>
+                <w:szCs w:val="15"/>
+              </w:rPr>
+              <w:t xml:space="preserve">• Ders kitabı: s. 53-59</w:t>
+            </w:r>
+          </w:p>
         </w:tc>
         <w:tc>
           <w:tcPr>
@@ -5290,6 +5430,26 @@
               <w:t xml:space="preserve">• Değer: “Selam sözden öncedir” anlayışı; selamın yaygınlaştırılması</w:t>
             </w:r>
           </w:p>
+          <w:p>
+            <w:pPr>
+              <w:spacing w:after="30" w:line="230"/>
+              <w:ind w:left="130" w:hanging="130"/>
+              <w:jc w:val="left"/>
+            </w:pPr>
+            <w:r>
+              <w:rPr>
+                <w:rFonts w:ascii="Times New Roman" w:cs="Times New Roman" w:eastAsia="Times New Roman" w:hAnsi="Times New Roman"/>
+                <w:b w:val="false"/>
+                <w:bCs w:val="false"/>
+                <w:i w:val="false"/>
+                <w:iCs w:val="false"/>
+                <w:color w:val="1A1A1A"/>
+                <w:sz w:val="15"/>
+                <w:szCs w:val="15"/>
+              </w:rPr>
+              <w:t xml:space="preserve">• Ders kitabı: s. 60-66</w:t>
+            </w:r>
+          </w:p>
         </w:tc>
         <w:tc>
           <w:tcPr>
@@ -5871,6 +6031,26 @@
               <w:t xml:space="preserve">• Ünite değerlendirme etkinlikleri</w:t>
             </w:r>
           </w:p>
+          <w:p>
+            <w:pPr>
+              <w:spacing w:after="30" w:line="230"/>
+              <w:ind w:left="130" w:hanging="130"/>
+              <w:jc w:val="left"/>
+            </w:pPr>
+            <w:r>
+              <w:rPr>
+                <w:rFonts w:ascii="Times New Roman" w:cs="Times New Roman" w:eastAsia="Times New Roman" w:hAnsi="Times New Roman"/>
+                <w:b w:val="false"/>
+                <w:bCs w:val="false"/>
+                <w:i w:val="false"/>
+                <w:iCs w:val="false"/>
+                <w:color w:val="1A1A1A"/>
+                <w:sz w:val="15"/>
+                <w:szCs w:val="15"/>
+              </w:rPr>
+              <w:t xml:space="preserve">• Ders kitabı: s. 67-73</w:t>
+            </w:r>
+          </w:p>
         </w:tc>
         <w:tc>
           <w:tcPr>
@@ -6467,6 +6647,26 @@
               <w:t xml:space="preserve">• Yazma: Harflerin kelime başındaki yazılışları</w:t>
             </w:r>
           </w:p>
+          <w:p>
+            <w:pPr>
+              <w:spacing w:after="30" w:line="230"/>
+              <w:ind w:left="130" w:hanging="130"/>
+              <w:jc w:val="left"/>
+            </w:pPr>
+            <w:r>
+              <w:rPr>
+                <w:rFonts w:ascii="Times New Roman" w:cs="Times New Roman" w:eastAsia="Times New Roman" w:hAnsi="Times New Roman"/>
+                <w:b w:val="false"/>
+                <w:bCs w:val="false"/>
+                <w:i w:val="false"/>
+                <w:iCs w:val="false"/>
+                <w:color w:val="1A1A1A"/>
+                <w:sz w:val="15"/>
+                <w:szCs w:val="15"/>
+              </w:rPr>
+              <w:t xml:space="preserve">• Ders kitabı: s. 74-82</w:t>
+            </w:r>
+          </w:p>
         </w:tc>
         <w:tc>
           <w:tcPr>
@@ -7048,6 +7248,26 @@
               <w:t xml:space="preserve">• Yazma: Harflerin kelime ortasındaki yazılışları</w:t>
             </w:r>
           </w:p>
+          <w:p>
+            <w:pPr>
+              <w:spacing w:after="30" w:line="230"/>
+              <w:ind w:left="130" w:hanging="130"/>
+              <w:jc w:val="left"/>
+            </w:pPr>
+            <w:r>
+              <w:rPr>
+                <w:rFonts w:ascii="Times New Roman" w:cs="Times New Roman" w:eastAsia="Times New Roman" w:hAnsi="Times New Roman"/>
+                <w:b w:val="false"/>
+                <w:bCs w:val="false"/>
+                <w:i w:val="false"/>
+                <w:iCs w:val="false"/>
+                <w:color w:val="1A1A1A"/>
+                <w:sz w:val="15"/>
+                <w:szCs w:val="15"/>
+              </w:rPr>
+              <w:t xml:space="preserve">• Ders kitabı: s. 83-91</w:t>
+            </w:r>
+          </w:p>
         </w:tc>
         <w:tc>
           <w:tcPr>
@@ -7589,6 +7809,26 @@
               <w:t xml:space="preserve">• Sözcük: Ünite sözcüklerinin işaret isimleriyle kullanımı</w:t>
             </w:r>
           </w:p>
+          <w:p>
+            <w:pPr>
+              <w:spacing w:after="30" w:line="230"/>
+              <w:ind w:left="130" w:hanging="130"/>
+              <w:jc w:val="left"/>
+            </w:pPr>
+            <w:r>
+              <w:rPr>
+                <w:rFonts w:ascii="Times New Roman" w:cs="Times New Roman" w:eastAsia="Times New Roman" w:hAnsi="Times New Roman"/>
+                <w:b w:val="false"/>
+                <w:bCs w:val="false"/>
+                <w:i w:val="false"/>
+                <w:iCs w:val="false"/>
+                <w:color w:val="1A1A1A"/>
+                <w:sz w:val="15"/>
+                <w:szCs w:val="15"/>
+              </w:rPr>
+              <w:t xml:space="preserve">• Ders kitabı: s. 92-99</w:t>
+            </w:r>
+          </w:p>
         </w:tc>
         <w:tc>
           <w:tcPr>
@@ -8150,6 +8390,26 @@
               <w:t xml:space="preserve">• Sözcük: Ünite sözcüklerinin sesletimi</w:t>
             </w:r>
           </w:p>
+          <w:p>
+            <w:pPr>
+              <w:spacing w:after="30" w:line="230"/>
+              <w:ind w:left="130" w:hanging="130"/>
+              <w:jc w:val="left"/>
+            </w:pPr>
+            <w:r>
+              <w:rPr>
+                <w:rFonts w:ascii="Times New Roman" w:cs="Times New Roman" w:eastAsia="Times New Roman" w:hAnsi="Times New Roman"/>
+                <w:b w:val="false"/>
+                <w:bCs w:val="false"/>
+                <w:i w:val="false"/>
+                <w:iCs w:val="false"/>
+                <w:color w:val="1A1A1A"/>
+                <w:sz w:val="15"/>
+                <w:szCs w:val="15"/>
+              </w:rPr>
+              <w:t xml:space="preserve">• Ders kitabı: s. 100-107</w:t>
+            </w:r>
+          </w:p>
         </w:tc>
         <w:tc>
           <w:tcPr>
@@ -8731,6 +8991,26 @@
               <w:t xml:space="preserve">• Sözcük: fî’s-sınıf, alâ’l-minzade, tahte’l-kürsî</w:t>
             </w:r>
           </w:p>
+          <w:p>
+            <w:pPr>
+              <w:spacing w:after="30" w:line="230"/>
+              <w:ind w:left="130" w:hanging="130"/>
+              <w:jc w:val="left"/>
+            </w:pPr>
+            <w:r>
+              <w:rPr>
+                <w:rFonts w:ascii="Times New Roman" w:cs="Times New Roman" w:eastAsia="Times New Roman" w:hAnsi="Times New Roman"/>
+                <w:b w:val="false"/>
+                <w:bCs w:val="false"/>
+                <w:i w:val="false"/>
+                <w:iCs w:val="false"/>
+                <w:color w:val="1A1A1A"/>
+                <w:sz w:val="15"/>
+                <w:szCs w:val="15"/>
+              </w:rPr>
+              <w:t xml:space="preserve">• Ders kitabı: s. 108-115</w:t>
+            </w:r>
+          </w:p>
         </w:tc>
         <w:tc>
           <w:tcPr>
@@ -9312,6 +9592,26 @@
               <w:t xml:space="preserve">• Sözcük: Ünite sözcüklerinin yazımı</w:t>
             </w:r>
           </w:p>
+          <w:p>
+            <w:pPr>
+              <w:spacing w:after="30" w:line="230"/>
+              <w:ind w:left="130" w:hanging="130"/>
+              <w:jc w:val="left"/>
+            </w:pPr>
+            <w:r>
+              <w:rPr>
+                <w:rFonts w:ascii="Times New Roman" w:cs="Times New Roman" w:eastAsia="Times New Roman" w:hAnsi="Times New Roman"/>
+                <w:b w:val="false"/>
+                <w:bCs w:val="false"/>
+                <w:i w:val="false"/>
+                <w:iCs w:val="false"/>
+                <w:color w:val="1A1A1A"/>
+                <w:sz w:val="15"/>
+                <w:szCs w:val="15"/>
+              </w:rPr>
+              <w:t xml:space="preserve">• Ders kitabı: s. 116-123</w:t>
+            </w:r>
+          </w:p>
         </w:tc>
         <w:tc>
           <w:tcPr>
@@ -9892,6 +10192,26 @@
               <w:t xml:space="preserve">• Dil bilgisi: Basit isim cümlesi kuruluşu</w:t>
             </w:r>
           </w:p>
+          <w:p>
+            <w:pPr>
+              <w:spacing w:after="30" w:line="230"/>
+              <w:ind w:left="130" w:hanging="130"/>
+              <w:jc w:val="left"/>
+            </w:pPr>
+            <w:r>
+              <w:rPr>
+                <w:rFonts w:ascii="Times New Roman" w:cs="Times New Roman" w:eastAsia="Times New Roman" w:hAnsi="Times New Roman"/>
+                <w:b w:val="false"/>
+                <w:bCs w:val="false"/>
+                <w:i w:val="false"/>
+                <w:iCs w:val="false"/>
+                <w:color w:val="1A1A1A"/>
+                <w:sz w:val="15"/>
+                <w:szCs w:val="15"/>
+              </w:rPr>
+              <w:t xml:space="preserve">• Ders kitabı: s. 124-131</w:t>
+            </w:r>
+          </w:p>
         </w:tc>
         <w:tc>
           <w:tcPr>
@@ -10473,6 +10793,26 @@
               <w:t xml:space="preserve">• Ünite değerlendirme etkinlikleri</w:t>
             </w:r>
           </w:p>
+          <w:p>
+            <w:pPr>
+              <w:spacing w:after="30" w:line="230"/>
+              <w:ind w:left="130" w:hanging="130"/>
+              <w:jc w:val="left"/>
+            </w:pPr>
+            <w:r>
+              <w:rPr>
+                <w:rFonts w:ascii="Times New Roman" w:cs="Times New Roman" w:eastAsia="Times New Roman" w:hAnsi="Times New Roman"/>
+                <w:b w:val="false"/>
+                <w:bCs w:val="false"/>
+                <w:i w:val="false"/>
+                <w:iCs w:val="false"/>
+                <w:color w:val="1A1A1A"/>
+                <w:sz w:val="15"/>
+                <w:szCs w:val="15"/>
+              </w:rPr>
+              <w:t xml:space="preserve">• Ders kitabı: s. 132-139</w:t>
+            </w:r>
+          </w:p>
         </w:tc>
         <w:tc>
           <w:tcPr>
@@ -11572,6 +11912,26 @@
               <w:t xml:space="preserve">• Dil bilgisi: Aile bireylerini tanıtan isim cümleleri</w:t>
             </w:r>
           </w:p>
+          <w:p>
+            <w:pPr>
+              <w:spacing w:after="30" w:line="230"/>
+              <w:ind w:left="130" w:hanging="130"/>
+              <w:jc w:val="left"/>
+            </w:pPr>
+            <w:r>
+              <w:rPr>
+                <w:rFonts w:ascii="Times New Roman" w:cs="Times New Roman" w:eastAsia="Times New Roman" w:hAnsi="Times New Roman"/>
+                <w:b w:val="false"/>
+                <w:bCs w:val="false"/>
+                <w:i w:val="false"/>
+                <w:iCs w:val="false"/>
+                <w:color w:val="1A1A1A"/>
+                <w:sz w:val="15"/>
+                <w:szCs w:val="15"/>
+              </w:rPr>
+              <w:t xml:space="preserve">• Ders kitabı: s. 140-144</w:t>
+            </w:r>
+          </w:p>
         </w:tc>
         <w:tc>
           <w:tcPr>
@@ -12133,6 +12493,26 @@
               <w:t xml:space="preserve">• Dil bilgisi: “mâ mihnetü…?” soru kalıbı</w:t>
             </w:r>
           </w:p>
+          <w:p>
+            <w:pPr>
+              <w:spacing w:after="30" w:line="230"/>
+              <w:ind w:left="130" w:hanging="130"/>
+              <w:jc w:val="left"/>
+            </w:pPr>
+            <w:r>
+              <w:rPr>
+                <w:rFonts w:ascii="Times New Roman" w:cs="Times New Roman" w:eastAsia="Times New Roman" w:hAnsi="Times New Roman"/>
+                <w:b w:val="false"/>
+                <w:bCs w:val="false"/>
+                <w:i w:val="false"/>
+                <w:iCs w:val="false"/>
+                <w:color w:val="1A1A1A"/>
+                <w:sz w:val="15"/>
+                <w:szCs w:val="15"/>
+              </w:rPr>
+              <w:t xml:space="preserve">• Ders kitabı: s. 145-149</w:t>
+            </w:r>
+          </w:p>
         </w:tc>
         <w:tc>
           <w:tcPr>
@@ -12714,6 +13094,26 @@
               <w:t xml:space="preserve">• Sözcük: Ünite sözcüklerinin metin içinde tanınması</w:t>
             </w:r>
           </w:p>
+          <w:p>
+            <w:pPr>
+              <w:spacing w:after="30" w:line="230"/>
+              <w:ind w:left="130" w:hanging="130"/>
+              <w:jc w:val="left"/>
+            </w:pPr>
+            <w:r>
+              <w:rPr>
+                <w:rFonts w:ascii="Times New Roman" w:cs="Times New Roman" w:eastAsia="Times New Roman" w:hAnsi="Times New Roman"/>
+                <w:b w:val="false"/>
+                <w:bCs w:val="false"/>
+                <w:i w:val="false"/>
+                <w:iCs w:val="false"/>
+                <w:color w:val="1A1A1A"/>
+                <w:sz w:val="15"/>
+                <w:szCs w:val="15"/>
+              </w:rPr>
+              <w:t xml:space="preserve">• Ders kitabı: s. 150-153</w:t>
+            </w:r>
+          </w:p>
         </w:tc>
         <w:tc>
           <w:tcPr>
@@ -13255,6 +13655,26 @@
               <w:t xml:space="preserve">• Dil bilgisi: Olumlu-olumsuz isim cümlesi (leyse / lâ)</w:t>
             </w:r>
           </w:p>
+          <w:p>
+            <w:pPr>
+              <w:spacing w:after="30" w:line="230"/>
+              <w:ind w:left="130" w:hanging="130"/>
+              <w:jc w:val="left"/>
+            </w:pPr>
+            <w:r>
+              <w:rPr>
+                <w:rFonts w:ascii="Times New Roman" w:cs="Times New Roman" w:eastAsia="Times New Roman" w:hAnsi="Times New Roman"/>
+                <w:b w:val="false"/>
+                <w:bCs w:val="false"/>
+                <w:i w:val="false"/>
+                <w:iCs w:val="false"/>
+                <w:color w:val="1A1A1A"/>
+                <w:sz w:val="15"/>
+                <w:szCs w:val="15"/>
+              </w:rPr>
+              <w:t xml:space="preserve">• Ders kitabı: s. 154-157</w:t>
+            </w:r>
+          </w:p>
         </w:tc>
         <w:tc>
           <w:tcPr>
@@ -13851,6 +14271,26 @@
               <w:t xml:space="preserve">• Sözcük: ebî, ümmî, ahî, uhtî</w:t>
             </w:r>
           </w:p>
+          <w:p>
+            <w:pPr>
+              <w:spacing w:after="30" w:line="230"/>
+              <w:ind w:left="130" w:hanging="130"/>
+              <w:jc w:val="left"/>
+            </w:pPr>
+            <w:r>
+              <w:rPr>
+                <w:rFonts w:ascii="Times New Roman" w:cs="Times New Roman" w:eastAsia="Times New Roman" w:hAnsi="Times New Roman"/>
+                <w:b w:val="false"/>
+                <w:bCs w:val="false"/>
+                <w:i w:val="false"/>
+                <w:iCs w:val="false"/>
+                <w:color w:val="1A1A1A"/>
+                <w:sz w:val="15"/>
+                <w:szCs w:val="15"/>
+              </w:rPr>
+              <w:t xml:space="preserve">• Ders kitabı: s. 158-161</w:t>
+            </w:r>
+          </w:p>
         </w:tc>
         <w:tc>
           <w:tcPr>
@@ -14452,6 +14892,26 @@
               <w:t xml:space="preserve">• Sözcük: Aile ve meslek sözcüklerinin bir arada kullanımı</w:t>
             </w:r>
           </w:p>
+          <w:p>
+            <w:pPr>
+              <w:spacing w:after="30" w:line="230"/>
+              <w:ind w:left="130" w:hanging="130"/>
+              <w:jc w:val="left"/>
+            </w:pPr>
+            <w:r>
+              <w:rPr>
+                <w:rFonts w:ascii="Times New Roman" w:cs="Times New Roman" w:eastAsia="Times New Roman" w:hAnsi="Times New Roman"/>
+                <w:b w:val="false"/>
+                <w:bCs w:val="false"/>
+                <w:i w:val="false"/>
+                <w:iCs w:val="false"/>
+                <w:color w:val="1A1A1A"/>
+                <w:sz w:val="15"/>
+                <w:szCs w:val="15"/>
+              </w:rPr>
+              <w:t xml:space="preserve">• Ders kitabı: s. 162-165</w:t>
+            </w:r>
+          </w:p>
         </w:tc>
         <w:tc>
           <w:tcPr>
@@ -15053,6 +15513,26 @@
               <w:t xml:space="preserve">• Sözcük: Ünite sözcüklerinin yazımı</w:t>
             </w:r>
           </w:p>
+          <w:p>
+            <w:pPr>
+              <w:spacing w:after="30" w:line="230"/>
+              <w:ind w:left="130" w:hanging="130"/>
+              <w:jc w:val="left"/>
+            </w:pPr>
+            <w:r>
+              <w:rPr>
+                <w:rFonts w:ascii="Times New Roman" w:cs="Times New Roman" w:eastAsia="Times New Roman" w:hAnsi="Times New Roman"/>
+                <w:b w:val="false"/>
+                <w:bCs w:val="false"/>
+                <w:i w:val="false"/>
+                <w:iCs w:val="false"/>
+                <w:color w:val="1A1A1A"/>
+                <w:sz w:val="15"/>
+                <w:szCs w:val="15"/>
+              </w:rPr>
+              <w:t xml:space="preserve">• Ders kitabı: s. 166-169</w:t>
+            </w:r>
+          </w:p>
         </w:tc>
         <w:tc>
           <w:tcPr>
@@ -15614,6 +16094,26 @@
               <w:t xml:space="preserve">• Dil bilgisi: Cümleleri “ve” bağlacıyla birleştirme</w:t>
             </w:r>
           </w:p>
+          <w:p>
+            <w:pPr>
+              <w:spacing w:after="30" w:line="230"/>
+              <w:ind w:left="130" w:hanging="130"/>
+              <w:jc w:val="left"/>
+            </w:pPr>
+            <w:r>
+              <w:rPr>
+                <w:rFonts w:ascii="Times New Roman" w:cs="Times New Roman" w:eastAsia="Times New Roman" w:hAnsi="Times New Roman"/>
+                <w:b w:val="false"/>
+                <w:bCs w:val="false"/>
+                <w:i w:val="false"/>
+                <w:iCs w:val="false"/>
+                <w:color w:val="1A1A1A"/>
+                <w:sz w:val="15"/>
+                <w:szCs w:val="15"/>
+              </w:rPr>
+              <w:t xml:space="preserve">• Ders kitabı: s. 170-173</w:t>
+            </w:r>
+          </w:p>
         </w:tc>
         <w:tc>
           <w:tcPr>
@@ -16215,6 +16715,26 @@
               <w:t xml:space="preserve">• Ünite değerlendirme etkinlikleri</w:t>
             </w:r>
           </w:p>
+          <w:p>
+            <w:pPr>
+              <w:spacing w:after="30" w:line="230"/>
+              <w:ind w:left="130" w:hanging="130"/>
+              <w:jc w:val="left"/>
+            </w:pPr>
+            <w:r>
+              <w:rPr>
+                <w:rFonts w:ascii="Times New Roman" w:cs="Times New Roman" w:eastAsia="Times New Roman" w:hAnsi="Times New Roman"/>
+                <w:b w:val="false"/>
+                <w:bCs w:val="false"/>
+                <w:i w:val="false"/>
+                <w:iCs w:val="false"/>
+                <w:color w:val="1A1A1A"/>
+                <w:sz w:val="15"/>
+                <w:szCs w:val="15"/>
+              </w:rPr>
+              <w:t xml:space="preserve">• Ders kitabı: s. 174-177</w:t>
+            </w:r>
+          </w:p>
         </w:tc>
         <w:tc>
           <w:tcPr>
@@ -16776,6 +17296,26 @@
               <w:t xml:space="preserve">• Dil bilgisi: “fî’l-beyt” yapısı</w:t>
             </w:r>
           </w:p>
+          <w:p>
+            <w:pPr>
+              <w:spacing w:after="30" w:line="230"/>
+              <w:ind w:left="130" w:hanging="130"/>
+              <w:jc w:val="left"/>
+            </w:pPr>
+            <w:r>
+              <w:rPr>
+                <w:rFonts w:ascii="Times New Roman" w:cs="Times New Roman" w:eastAsia="Times New Roman" w:hAnsi="Times New Roman"/>
+                <w:b w:val="false"/>
+                <w:bCs w:val="false"/>
+                <w:i w:val="false"/>
+                <w:iCs w:val="false"/>
+                <w:color w:val="1A1A1A"/>
+                <w:sz w:val="15"/>
+                <w:szCs w:val="15"/>
+              </w:rPr>
+              <w:t xml:space="preserve">• Ders kitabı: s. 178-183</w:t>
+            </w:r>
+          </w:p>
         </w:tc>
         <w:tc>
           <w:tcPr>
@@ -17376,6 +17916,26 @@
               <w:t xml:space="preserve">• Okuma: Görsel destekli sözcük okuma</w:t>
             </w:r>
           </w:p>
+          <w:p>
+            <w:pPr>
+              <w:spacing w:after="30" w:line="230"/>
+              <w:ind w:left="130" w:hanging="130"/>
+              <w:jc w:val="left"/>
+            </w:pPr>
+            <w:r>
+              <w:rPr>
+                <w:rFonts w:ascii="Times New Roman" w:cs="Times New Roman" w:eastAsia="Times New Roman" w:hAnsi="Times New Roman"/>
+                <w:b w:val="false"/>
+                <w:bCs w:val="false"/>
+                <w:i w:val="false"/>
+                <w:iCs w:val="false"/>
+                <w:color w:val="1A1A1A"/>
+                <w:sz w:val="15"/>
+                <w:szCs w:val="15"/>
+              </w:rPr>
+              <w:t xml:space="preserve">• Ders kitabı: s. 184-189</w:t>
+            </w:r>
+          </w:p>
         </w:tc>
         <w:tc>
           <w:tcPr>
@@ -17917,6 +18477,26 @@
               <w:t xml:space="preserve">• Dil bilgisi: İsim cümlesinde haberin yer zarfı olması</w:t>
             </w:r>
           </w:p>
+          <w:p>
+            <w:pPr>
+              <w:spacing w:after="30" w:line="230"/>
+              <w:ind w:left="130" w:hanging="130"/>
+              <w:jc w:val="left"/>
+            </w:pPr>
+            <w:r>
+              <w:rPr>
+                <w:rFonts w:ascii="Times New Roman" w:cs="Times New Roman" w:eastAsia="Times New Roman" w:hAnsi="Times New Roman"/>
+                <w:b w:val="false"/>
+                <w:bCs w:val="false"/>
+                <w:i w:val="false"/>
+                <w:iCs w:val="false"/>
+                <w:color w:val="1A1A1A"/>
+                <w:sz w:val="15"/>
+                <w:szCs w:val="15"/>
+              </w:rPr>
+              <w:t xml:space="preserve">• Ders kitabı: s. 190-195</w:t>
+            </w:r>
+          </w:p>
         </w:tc>
         <w:tc>
           <w:tcPr>
@@ -18498,6 +19078,26 @@
               <w:t xml:space="preserve">• Dil bilgisi: “kem…?” soru kalıbı</w:t>
             </w:r>
           </w:p>
+          <w:p>
+            <w:pPr>
+              <w:spacing w:after="30" w:line="230"/>
+              <w:ind w:left="130" w:hanging="130"/>
+              <w:jc w:val="left"/>
+            </w:pPr>
+            <w:r>
+              <w:rPr>
+                <w:rFonts w:ascii="Times New Roman" w:cs="Times New Roman" w:eastAsia="Times New Roman" w:hAnsi="Times New Roman"/>
+                <w:b w:val="false"/>
+                <w:bCs w:val="false"/>
+                <w:i w:val="false"/>
+                <w:iCs w:val="false"/>
+                <w:color w:val="1A1A1A"/>
+                <w:sz w:val="15"/>
+                <w:szCs w:val="15"/>
+              </w:rPr>
+              <w:t xml:space="preserve">• Ders kitabı: s. 196-201</w:t>
+            </w:r>
+          </w:p>
         </w:tc>
         <w:tc>
           <w:tcPr>
@@ -19039,6 +19639,26 @@
               <w:t xml:space="preserve">• Sözcük: Ev eşyalarının yer bildiren yapılarla kullanımı</w:t>
             </w:r>
           </w:p>
+          <w:p>
+            <w:pPr>
+              <w:spacing w:after="30" w:line="230"/>
+              <w:ind w:left="130" w:hanging="130"/>
+              <w:jc w:val="left"/>
+            </w:pPr>
+            <w:r>
+              <w:rPr>
+                <w:rFonts w:ascii="Times New Roman" w:cs="Times New Roman" w:eastAsia="Times New Roman" w:hAnsi="Times New Roman"/>
+                <w:b w:val="false"/>
+                <w:bCs w:val="false"/>
+                <w:i w:val="false"/>
+                <w:iCs w:val="false"/>
+                <w:color w:val="1A1A1A"/>
+                <w:sz w:val="15"/>
+                <w:szCs w:val="15"/>
+              </w:rPr>
+              <w:t xml:space="preserve">• Ders kitabı: s. 202-207</w:t>
+            </w:r>
+          </w:p>
         </w:tc>
         <w:tc>
           <w:tcPr>
@@ -19699,6 +20319,26 @@
               <w:t xml:space="preserve">• Sözcük: cemîl, kebîr, sağîr, nazîf, cedîd</w:t>
             </w:r>
           </w:p>
+          <w:p>
+            <w:pPr>
+              <w:spacing w:after="30" w:line="230"/>
+              <w:ind w:left="130" w:hanging="130"/>
+              <w:jc w:val="left"/>
+            </w:pPr>
+            <w:r>
+              <w:rPr>
+                <w:rFonts w:ascii="Times New Roman" w:cs="Times New Roman" w:eastAsia="Times New Roman" w:hAnsi="Times New Roman"/>
+                <w:b w:val="false"/>
+                <w:bCs w:val="false"/>
+                <w:i w:val="false"/>
+                <w:iCs w:val="false"/>
+                <w:color w:val="1A1A1A"/>
+                <w:sz w:val="15"/>
+                <w:szCs w:val="15"/>
+              </w:rPr>
+              <w:t xml:space="preserve">• Ders kitabı: s. 208-213</w:t>
+            </w:r>
+          </w:p>
         </w:tc>
         <w:tc>
           <w:tcPr>
@@ -20280,6 +20920,26 @@
               <w:t xml:space="preserve">• Sözcük: Ünite sözcüklerinin yazımı</w:t>
             </w:r>
           </w:p>
+          <w:p>
+            <w:pPr>
+              <w:spacing w:after="30" w:line="230"/>
+              <w:ind w:left="130" w:hanging="130"/>
+              <w:jc w:val="left"/>
+            </w:pPr>
+            <w:r>
+              <w:rPr>
+                <w:rFonts w:ascii="Times New Roman" w:cs="Times New Roman" w:eastAsia="Times New Roman" w:hAnsi="Times New Roman"/>
+                <w:b w:val="false"/>
+                <w:bCs w:val="false"/>
+                <w:i w:val="false"/>
+                <w:iCs w:val="false"/>
+                <w:color w:val="1A1A1A"/>
+                <w:sz w:val="15"/>
+                <w:szCs w:val="15"/>
+              </w:rPr>
+              <w:t xml:space="preserve">• Ders kitabı: s. 214-218</w:t>
+            </w:r>
+          </w:p>
         </w:tc>
         <w:tc>
           <w:tcPr>
@@ -20879,6 +21539,26 @@
                 <w:szCs w:val="15"/>
               </w:rPr>
               <w:t xml:space="preserve">• Değer: Evi ve aileyi güzelleştiren davranışlar</w:t>
+            </w:r>
+          </w:p>
+          <w:p>
+            <w:pPr>
+              <w:spacing w:after="30" w:line="230"/>
+              <w:ind w:left="130" w:hanging="130"/>
+              <w:jc w:val="left"/>
+            </w:pPr>
+            <w:r>
+              <w:rPr>
+                <w:rFonts w:ascii="Times New Roman" w:cs="Times New Roman" w:eastAsia="Times New Roman" w:hAnsi="Times New Roman"/>
+                <w:b w:val="false"/>
+                <w:bCs w:val="false"/>
+                <w:i w:val="false"/>
+                <w:iCs w:val="false"/>
+                <w:color w:val="1A1A1A"/>
+                <w:sz w:val="15"/>
+                <w:szCs w:val="15"/>
+              </w:rPr>
+              <w:t xml:space="preserve">• Ders kitabı: s. 219-223</w:t>
             </w:r>
           </w:p>
         </w:tc>

</xml_diff>